<commit_message>
Regenerate final presentation with implementation focus
The final deck (15 slides) and presenter script now centre on the
implementation and the five-step Workspace: architecture, text to tokens
to tree, diagnosis, fixes, one error at a time, asking instead of guessing,
safe repairs, the tree and honest completion. Research is one brief,
conceptual slide. The previous deck is kept as
IntelliFix_Final_Presentation_previous.pptx.

- build/build_implementation_presentation.js, implementation_slides_content.js
- build/take_screenshots_v3.cjs and docs/images/walkthrough/v3-*.png (real run)
- build_final_script.js now uses the new content and demo checklist

Co-Authored-By: Claude Opus 5.5 <noreply@anthropic.com>
Claude-Session: https://claude.ai/code/session_01LN3aP12Kazsco3fvRuXYxh
</commit_message>
<xml_diff>
--- a/parallax/deliverables/IntelliFix_Final_Presentation_Script.docx
+++ b/parallax/deliverables/IntelliFix_Final_Presentation_Script.docx
@@ -67,7 +67,7 @@
         <w:rPr>
           <w:rFonts w:ascii="Courier New" w:cs="Courier New" w:eastAsia="Courier New" w:hAnsi="Courier New"/>
         </w:rPr>
-        <w:t xml:space="preserve">deliverables/build/final_slides_content.js</w:t>
+        <w:t xml:space="preserve">deliverables/build/implementation_slides_content.js</w:t>
       </w:r>
       <w:r>
         <w:t xml:space="preserve">). Speaking parts are a suggested split by section; they do </w:t>
@@ -392,7 +392,7 @@
                 <w:sz w:val="21"/>
                 <w:szCs w:val="21"/>
               </w:rPr>
-              <w:t xml:space="preserve">Detected on line 4, made on line 3</w:t>
+              <w:t xml:space="preserve">Why syntax errors are hard</w:t>
             </w:r>
           </w:p>
         </w:tc>
@@ -493,7 +493,7 @@
                 <w:sz w:val="21"/>
                 <w:szCs w:val="21"/>
               </w:rPr>
-              <w:t xml:space="preserve">Objectives and scope</w:t>
+              <w:t xml:space="preserve">The idea: a compiler that explains and asks</w:t>
             </w:r>
           </w:p>
         </w:tc>
@@ -594,7 +594,7 @@
                 <w:sz w:val="21"/>
                 <w:szCs w:val="21"/>
               </w:rPr>
-              <w:t xml:space="preserve">Architecture and workflow</w:t>
+              <w:t xml:space="preserve">Architecture</w:t>
             </w:r>
           </w:p>
         </w:tc>
@@ -695,7 +695,7 @@
                 <w:sz w:val="21"/>
                 <w:szCs w:val="21"/>
               </w:rPr>
-              <w:t xml:space="preserve">Lexer, parser and candidate validation</w:t>
+              <w:t xml:space="preserve">From text to tokens to a tree</w:t>
             </w:r>
           </w:p>
         </w:tc>
@@ -719,7 +719,7 @@
                 <w:sz w:val="21"/>
                 <w:szCs w:val="21"/>
               </w:rPr>
-              <w:t xml:space="preserve">S Charumeena</w:t>
+              <w:t xml:space="preserve">Goutam Jayasingh</w:t>
             </w:r>
           </w:p>
         </w:tc>
@@ -743,7 +743,7 @@
                 <w:sz w:val="21"/>
                 <w:szCs w:val="21"/>
               </w:rPr>
-              <w:t xml:space="preserve">1.25</w:t>
+              <w:t xml:space="preserve">1</w:t>
             </w:r>
           </w:p>
         </w:tc>
@@ -796,7 +796,7 @@
                 <w:sz w:val="21"/>
                 <w:szCs w:val="21"/>
               </w:rPr>
-              <w:t xml:space="preserve">Interactive ambiguity resolution</w:t>
+              <w:t xml:space="preserve">The Workspace: five steps</w:t>
             </w:r>
           </w:p>
         </w:tc>
@@ -844,7 +844,7 @@
                 <w:sz w:val="21"/>
                 <w:szCs w:val="21"/>
               </w:rPr>
-              <w:t xml:space="preserve">1.25</w:t>
+              <w:t xml:space="preserve">1</w:t>
             </w:r>
           </w:p>
         </w:tc>
@@ -897,7 +897,7 @@
                 <w:sz w:val="21"/>
                 <w:szCs w:val="21"/>
               </w:rPr>
-              <w:t xml:space="preserve">Explainable repair comparison</w:t>
+              <w:t xml:space="preserve">Step 2 · Diagnosis: what was found, and why</w:t>
             </w:r>
           </w:p>
         </w:tc>
@@ -945,7 +945,7 @@
                 <w:sz w:val="21"/>
                 <w:szCs w:val="21"/>
               </w:rPr>
-              <w:t xml:space="preserve">1.25</w:t>
+              <w:t xml:space="preserve">1</w:t>
             </w:r>
           </w:p>
         </w:tc>
@@ -998,7 +998,7 @@
                 <w:sz w:val="21"/>
                 <w:szCs w:val="21"/>
               </w:rPr>
-              <w:t xml:space="preserve">A detailed AST explorer</w:t>
+              <w:t xml:space="preserve">Step 3 · Fixes: generate, check, rank, decide</w:t>
             </w:r>
           </w:p>
         </w:tc>
@@ -1099,7 +1099,7 @@
                 <w:sz w:val="21"/>
                 <w:szCs w:val="21"/>
               </w:rPr>
-              <w:t xml:space="preserve">Before and after a repair</w:t>
+              <w:t xml:space="preserve">One error at a time, re-checked every time</w:t>
             </w:r>
           </w:p>
         </w:tc>
@@ -1147,7 +1147,7 @@
                 <w:sz w:val="21"/>
                 <w:szCs w:val="21"/>
               </w:rPr>
-              <w:t xml:space="preserve">1</w:t>
+              <w:t xml:space="preserve">1.25</w:t>
             </w:r>
           </w:p>
         </w:tc>
@@ -1200,7 +1200,7 @@
                 <w:sz w:val="21"/>
                 <w:szCs w:val="21"/>
               </w:rPr>
-              <w:t xml:space="preserve">Explanations and guided repair</w:t>
+              <w:t xml:space="preserve">Asking instead of guessing</w:t>
             </w:r>
           </w:p>
         </w:tc>
@@ -1301,7 +1301,7 @@
                 <w:sz w:val="21"/>
                 <w:szCs w:val="21"/>
               </w:rPr>
-              <w:t xml:space="preserve">Method and verified results</w:t>
+              <w:t xml:space="preserve">Safe repairs: parsing is not meaning</w:t>
             </w:r>
           </w:p>
         </w:tc>
@@ -1325,7 +1325,7 @@
                 <w:sz w:val="21"/>
                 <w:szCs w:val="21"/>
               </w:rPr>
-              <w:t xml:space="preserve">Raguraman Govindasamy</w:t>
+              <w:t xml:space="preserve">S Charumeena</w:t>
             </w:r>
           </w:p>
         </w:tc>
@@ -1349,7 +1349,7 @@
                 <w:sz w:val="21"/>
                 <w:szCs w:val="21"/>
               </w:rPr>
-              <w:t xml:space="preserve">1.5</w:t>
+              <w:t xml:space="preserve">1.25</w:t>
             </w:r>
           </w:p>
         </w:tc>
@@ -1402,7 +1402,7 @@
                 <w:sz w:val="21"/>
                 <w:szCs w:val="21"/>
               </w:rPr>
-              <w:t xml:space="preserve">Ablations and negative results</w:t>
+              <w:t xml:space="preserve">Step 4 · The tree: what a fix changes</w:t>
             </w:r>
           </w:p>
         </w:tc>
@@ -1450,7 +1450,7 @@
                 <w:sz w:val="21"/>
                 <w:szCs w:val="21"/>
               </w:rPr>
-              <w:t xml:space="preserve">1.25</w:t>
+              <w:t xml:space="preserve">1</w:t>
             </w:r>
           </w:p>
         </w:tc>
@@ -1503,7 +1503,7 @@
                 <w:sz w:val="21"/>
                 <w:szCs w:val="21"/>
               </w:rPr>
-              <w:t xml:space="preserve">Testing, limits and platforms</w:t>
+              <w:t xml:space="preserve">Step 5 · Verify, and finish honestly</w:t>
             </w:r>
           </w:p>
         </w:tc>
@@ -1551,7 +1551,7 @@
                 <w:sz w:val="21"/>
                 <w:szCs w:val="21"/>
               </w:rPr>
-              <w:t xml:space="preserve">1.25</w:t>
+              <w:t xml:space="preserve">1</w:t>
             </w:r>
           </w:p>
         </w:tc>
@@ -1604,7 +1604,7 @@
                 <w:sz w:val="21"/>
                 <w:szCs w:val="21"/>
               </w:rPr>
-              <w:t xml:space="preserve">Live demo</w:t>
+              <w:t xml:space="preserve">Research in brief</w:t>
             </w:r>
           </w:p>
         </w:tc>
@@ -1628,7 +1628,7 @@
                 <w:sz w:val="21"/>
                 <w:szCs w:val="21"/>
               </w:rPr>
-              <w:t xml:space="preserve">All three (driver, narrator, checker)</w:t>
+              <w:t xml:space="preserve">Raguraman Govindasamy</w:t>
             </w:r>
           </w:p>
         </w:tc>
@@ -1652,7 +1652,7 @@
                 <w:sz w:val="21"/>
                 <w:szCs w:val="21"/>
               </w:rPr>
-              <w:t xml:space="preserve">6</w:t>
+              <w:t xml:space="preserve">1</w:t>
             </w:r>
           </w:p>
         </w:tc>
@@ -1705,7 +1705,7 @@
                 <w:sz w:val="21"/>
                 <w:szCs w:val="21"/>
               </w:rPr>
-              <w:t xml:space="preserve">Contribution and future work</w:t>
+              <w:t xml:space="preserve">Limits and next steps</w:t>
             </w:r>
           </w:p>
         </w:tc>
@@ -1729,7 +1729,7 @@
                 <w:sz w:val="21"/>
                 <w:szCs w:val="21"/>
               </w:rPr>
-              <w:t xml:space="preserve">Raguraman Govindasamy</w:t>
+              <w:t xml:space="preserve">All three (driver, narrator, checker)</w:t>
             </w:r>
           </w:p>
         </w:tc>
@@ -1840,7 +1840,7 @@
                 <w:sz w:val="21"/>
                 <w:szCs w:val="21"/>
               </w:rPr>
-              <w:t xml:space="preserve">21.75</w:t>
+              <w:t xml:space="preserve">15.5</w:t>
             </w:r>
           </w:p>
         </w:tc>
@@ -1946,7 +1946,7 @@
         <w:t xml:space="preserve">Say: </w:t>
       </w:r>
       <w:r>
-        <w:t xml:space="preserve">Good morning. We are presenting IntelliFix: an intelligent compiler for syntax error analysis, detection and correction, for a small C-like teaching language called MiniC. I am Goutam Jayasingh, and with me are S Charumeena and Raguraman Govindasamy. We will show the problem, how the system works, a live demo on the real compiler, and how we measured it — including what did not work.</w:t>
+        <w:t xml:space="preserve">IntelliFix is a compiler that does not stop at "syntax error". It explains what went wrong, proposes fixes it has really checked, asks us when it cannot know what we meant, and walks us through every error until the program passes all the checks it performs.</w:t>
       </w:r>
     </w:p>
     <w:p>
@@ -1961,7 +1961,7 @@
         <w:t xml:space="preserve">Technical details for the professor: </w:t>
       </w:r>
       <w:r>
-        <w:t xml:space="preserve">Native C++17 compiler (Flex + Bison), FastAPI backend, React interface (Workspace, AST Explorer, Research &amp; Method); everything shown comes from the real compiler.</w:t>
+        <w:t xml:space="preserve">A real Flex/Bison compiler front end for MiniC (C++17), a FastAPI backend and a React interface with three destinations: Workspace, AST Explorer, Research &amp; Method.</w:t>
       </w:r>
     </w:p>
     <w:p>
@@ -1991,7 +1991,7 @@
         <w:t xml:space="preserve">Transition: </w:t>
       </w:r>
       <w:r>
-        <w:t xml:space="preserve">Let us start with the problem every programmer has met.</w:t>
+        <w:t xml:space="preserve">Let us start with why syntax errors are harder than they look.</w:t>
       </w:r>
     </w:p>
     <w:p>
@@ -1999,7 +1999,7 @@
         <w:pStyle w:val="Heading2"/>
       </w:pPr>
       <w:r>
-        <w:t xml:space="preserve">Slide 2 — Detected on line 4, made on line 3</w:t>
+        <w:t xml:space="preserve">Slide 2 — Why syntax errors are hard</w:t>
       </w:r>
     </w:p>
     <w:p>
@@ -2029,7 +2029,7 @@
         <w:t xml:space="preserve">Say: </w:t>
       </w:r>
       <w:r>
-        <w:t xml:space="preserve">In this program the semicolon is missing at the end of line 3, but the parser complains about line 4. An LR parser only notices a problem at the first token that cannot continue any valid program, so the detection point and the real mistake are different places. Second problem: many edits make the program parse. Replacing int on line 4 with a comma also gives valid code. A tool that silently picks one can be confidently wrong, and a beginner cannot tell.</w:t>
+        <w:t xml:space="preserve">Three ideas. First, a parser reports where it got stuck, which is often after the real mistake: a missing semicolon is noticed on the next line. Second, one error hides others: after the first error the parser can only guess how to continue. Third, many different edits make code parse again, and they can mean very different programs. A good tool has to deal with all three.</w:t>
       </w:r>
     </w:p>
     <w:p>
@@ -2044,22 +2044,7 @@
         <w:t xml:space="preserve">Technical details for the professor: </w:t>
       </w:r>
       <w:r>
-        <w:t xml:space="preserve">Correct-prefix property of LR parsing; the error is detected at 4:3 (token int, LR state 47); the edit that restores the original is at 3:16.</w:t>
-      </w:r>
-    </w:p>
-    <w:p>
-      <w:pPr>
-        <w:spacing w:after="80" w:line="276" w:lineRule="auto"/>
-      </w:pPr>
-      <w:r>
-        <w:rPr>
-          <w:b/>
-          <w:bCs/>
-        </w:rPr>
-        <w:t xml:space="preserve">Live-demo action: </w:t>
-      </w:r>
-      <w:r>
-        <w:t xml:space="preserve">Workspace → sample Missing semicolon → Analyze → step 2 Diagnosis (lexer → parser panel).</w:t>
+        <w:t xml:space="preserve">LR parsers detect an error at the first token for which no action exists; panic-mode recovery skips to a synchronising token, so later reports may be side effects.</w:t>
       </w:r>
     </w:p>
     <w:p>
@@ -2074,7 +2059,7 @@
         <w:t xml:space="preserve">Transition: </w:t>
       </w:r>
       <w:r>
-        <w:t xml:space="preserve">So what exactly did we set out to build?</w:t>
+        <w:t xml:space="preserve">Our answer is a pipeline with the user inside the loop.</w:t>
       </w:r>
     </w:p>
     <w:p>
@@ -2104,10 +2089,10 @@
           <w:b/>
           <w:bCs/>
         </w:rPr>
-        <w:t xml:space="preserve">Why does the parser report line 4?</w:t>
-      </w:r>
-      <w:r>
-        <w:t xml:space="preserve"> Until it reads int, the input could still be a longer expression; only then does no valid continuation exist (correct-prefix property).</w:t>
+        <w:t xml:space="preserve">Why not just show the compiler message?</w:t>
+      </w:r>
+      <w:r>
+        <w:t xml:space="preserve"> Because it names the place of detection, not the cause, and it never says that several fixes are possible.</w:t>
       </w:r>
     </w:p>
     <w:p>
@@ -2115,7 +2100,7 @@
         <w:pStyle w:val="Heading2"/>
       </w:pPr>
       <w:r>
-        <w:t xml:space="preserve">Slide 3 — Objectives and scope</w:t>
+        <w:t xml:space="preserve">Slide 3 — The idea: a compiler that explains and asks</w:t>
       </w:r>
     </w:p>
     <w:p>
@@ -2145,7 +2130,7 @@
         <w:t xml:space="preserve">Say: </w:t>
       </w:r>
       <w:r>
-        <w:t xml:space="preserve">Our objectives: a real MiniC front end with exact error positions; repair candidates that the real parser checks; ranking by evidence instead of edit cost alone; honest decisions that say when the tool is not sure; explanations a beginner can follow; and an evaluation with baselines and confidence intervals. MiniC has functions, arrays, if, while, for and the usual operators. It deliberately leaves out pointers, structs, strings and operators like plus-plus; IntelliFix recognises those C features and says so instead of inventing a repair. We do not do type checking or run programs.</w:t>
+        <w:t xml:space="preserve">We keep a real compiler front end, the lexer and the parser, and add a repair engine on top. The engine tries small edits and keeps only those the real parser accepts. Then the user decides. After every applied fix the whole program is analysed again. That loop is the core of the project: explain, propose, confirm, re-check.</w:t>
       </w:r>
     </w:p>
     <w:p>
@@ -2160,7 +2145,7 @@
         <w:t xml:space="preserve">Technical details for the professor: </w:t>
       </w:r>
       <w:r>
-        <w:t xml:space="preserve">97 grammar rules, 168 LR states, %expect 0; C constructs are lexed as UNSUPPORTED tokens with advice.</w:t>
+        <w:t xml:space="preserve">Nothing in the interface is simulated: every result is a fresh run of parallaxc; every proposal is re-parsed before it can be applied.</w:t>
       </w:r>
     </w:p>
     <w:p>
@@ -2175,7 +2160,75 @@
         <w:t xml:space="preserve">Transition: </w:t>
       </w:r>
       <w:r>
-        <w:t xml:space="preserve">Here is how the pieces fit together.</w:t>
+        <w:t xml:space="preserve">Here is how the parts are connected.</w:t>
+      </w:r>
+    </w:p>
+    <w:p>
+      <w:pPr>
+        <w:pStyle w:val="Heading2"/>
+      </w:pPr>
+      <w:r>
+        <w:t xml:space="preserve">Slide 4 — Architecture</w:t>
+      </w:r>
+    </w:p>
+    <w:p>
+      <w:pPr>
+        <w:spacing w:after="80" w:line="276" w:lineRule="auto"/>
+      </w:pPr>
+      <w:r>
+        <w:rPr>
+          <w:b/>
+          <w:bCs/>
+        </w:rPr>
+        <w:t xml:space="preserve">Speaker: </w:t>
+      </w:r>
+      <w:r>
+        <w:t xml:space="preserve">Goutam Jayasingh  ·  about 1 min</w:t>
+      </w:r>
+    </w:p>
+    <w:p>
+      <w:pPr>
+        <w:spacing w:after="80" w:line="276" w:lineRule="auto"/>
+      </w:pPr>
+      <w:r>
+        <w:rPr>
+          <w:b/>
+          <w:bCs/>
+        </w:rPr>
+        <w:t xml:space="preserve">Say: </w:t>
+      </w:r>
+      <w:r>
+        <w:t xml:space="preserve">Three layers. The browser is where you write code and follow the steps. The backend receives the code and runs the compiler safely, with a timeout and without a shell. The compiler does the real work: tokens, parse, tree, repairs, as JSON. Because every answer carries the exact text it belongs to, the screen never mixes an old result with new code.</w:t>
+      </w:r>
+    </w:p>
+    <w:p>
+      <w:pPr>
+        <w:spacing w:after="80" w:line="276" w:lineRule="auto"/>
+      </w:pPr>
+      <w:r>
+        <w:rPr>
+          <w:b/>
+          <w:bCs/>
+        </w:rPr>
+        <w:t xml:space="preserve">Technical details for the professor: </w:t>
+      </w:r>
+      <w:r>
+        <w:t xml:space="preserve">React + TypeScript (Vite) · FastAPI (Python) · parallaxc (C++17, Flex, Bison with LAC). Stale responses are discarded by sequence numbers; each result stores its source text.</w:t>
+      </w:r>
+    </w:p>
+    <w:p>
+      <w:pPr>
+        <w:spacing w:after="80" w:line="276" w:lineRule="auto"/>
+      </w:pPr>
+      <w:r>
+        <w:rPr>
+          <w:b/>
+          <w:bCs/>
+        </w:rPr>
+        <w:t xml:space="preserve">Transition: </w:t>
+      </w:r>
+      <w:r>
+        <w:t xml:space="preserve">Inside the compiler: how text becomes structure.</w:t>
       </w:r>
     </w:p>
     <w:p>
@@ -2205,10 +2258,10 @@
           <w:b/>
           <w:bCs/>
         </w:rPr>
-        <w:t xml:space="preserve">Why not full C?</w:t>
-      </w:r>
-      <w:r>
-        <w:t xml:space="preserve"> Typedef names make C's grammar context-sensitive and the preprocessor dominates; a subset keeps the repair research testable.</w:t>
+        <w:t xml:space="preserve">Why a separate C++ compiler?</w:t>
+      </w:r>
+      <w:r>
+        <w:t xml:space="preserve"> Bison gives a real LALR(1) parser with exact expected-token sets; the repair engine needs to call it thousands of times quickly.</w:t>
       </w:r>
     </w:p>
     <w:p>
@@ -2216,7 +2269,7 @@
         <w:pStyle w:val="Heading2"/>
       </w:pPr>
       <w:r>
-        <w:t xml:space="preserve">Slide 4 — Architecture and workflow</w:t>
+        <w:t xml:space="preserve">Slide 5 — From text to tokens to a tree</w:t>
       </w:r>
     </w:p>
     <w:p>
@@ -2246,7 +2299,7 @@
         <w:t xml:space="preserve">Say: </w:t>
       </w:r>
       <w:r>
-        <w:t xml:space="preserve">The browser sends your code to a FastAPI backend, which runs the native compiler, parallaxc, as a separate process for every request and passes its JSON back. The compiler runs eight stages: lex, parse, localise the first error, generate and validate candidates, rank and group them, follow later errors in hypothesis lanes, and decide. The interface only displays this output. If the compiler is not built, the site says so instead of showing anything fake.</w:t>
+        <w:t xml:space="preserve">The lexer cuts the text into tokens: names, numbers, operators. It checks spelling, not order. The parser checks the order of tokens against the grammar and builds the abstract syntax tree. The tree has no punctuation: the shape itself says that 2 times 3 is computed before the addition. What the compiler does not check is meaning: types and behaviour are outside a syntax tool.</w:t>
       </w:r>
     </w:p>
     <w:p>
@@ -2261,7 +2314,7 @@
         <w:t xml:space="preserve">Technical details for the professor: </w:t>
       </w:r>
       <w:r>
-        <w:t xml:space="preserve">Subprocess per request in a worker thread with size (64 KB), time and concurrency limits; HTTP 503 COMPILER_UNAVAILABLE when the binary is missing.</w:t>
+        <w:t xml:space="preserve">Grammar in compiler/grammar/minic.y; 26 AST node kinds; precedence encoded by the rule chain or_expr → … → mul_expr → unary.</w:t>
       </w:r>
     </w:p>
     <w:p>
@@ -2276,7 +2329,7 @@
         <w:t xml:space="preserve">Live-demo action: </w:t>
       </w:r>
       <w:r>
-        <w:t xml:space="preserve">Research &amp; Method → section 2 (how IntelliFix works).</w:t>
+        <w:t xml:space="preserve">Workspace → step 2 shows the Lexer → Parser → Meaning panel.</w:t>
       </w:r>
     </w:p>
     <w:p>
@@ -2291,7 +2344,7 @@
         <w:t xml:space="preserve">Transition: </w:t>
       </w:r>
       <w:r>
-        <w:t xml:space="preserve">Charumeena will take you inside the compiler.</w:t>
+        <w:t xml:space="preserve">Now the part users see: the Workspace.</w:t>
       </w:r>
     </w:p>
     <w:p>
@@ -2321,10 +2374,28 @@
           <w:b/>
           <w:bCs/>
         </w:rPr>
-        <w:t xml:space="preserve">Why a subprocess instead of a library?</w:t>
-      </w:r>
-      <w:r>
-        <w:t xml:space="preserve"> Isolation and timeouts: a crash cannot take down the server, and one binary serves the CLI, the evaluation and the UI.</w:t>
+        <w:t xml:space="preserve">Lexer or parser error?</w:t>
+      </w:r>
+      <w:r>
+        <w:t xml:space="preserve"> </w:t>
+      </w:r>
+      <w:r>
+        <w:rPr>
+          <w:rFonts w:ascii="Courier New" w:cs="Courier New" w:eastAsia="Courier New" w:hAnsi="Courier New"/>
+        </w:rPr>
+        <w:t xml:space="preserve">$</w:t>
+      </w:r>
+      <w:r>
+        <w:t xml:space="preserve"> is a lexer error; </w:t>
+      </w:r>
+      <w:r>
+        <w:rPr>
+          <w:rFonts w:ascii="Courier New" w:cs="Courier New" w:eastAsia="Courier New" w:hAnsi="Courier New"/>
+        </w:rPr>
+        <w:t xml:space="preserve">x x;</w:t>
+      </w:r>
+      <w:r>
+        <w:t xml:space="preserve"> is fine for the lexer but a parser error.</w:t>
       </w:r>
     </w:p>
     <w:p>
@@ -2332,7 +2403,7 @@
         <w:pStyle w:val="Heading2"/>
       </w:pPr>
       <w:r>
-        <w:t xml:space="preserve">Slide 5 — Lexer, parser and candidate validation</w:t>
+        <w:t xml:space="preserve">Slide 6 — The Workspace: five steps</w:t>
       </w:r>
     </w:p>
     <w:p>
@@ -2347,7 +2418,7 @@
         <w:t xml:space="preserve">Speaker: </w:t>
       </w:r>
       <w:r>
-        <w:t xml:space="preserve">S Charumeena  ·  about 1.25 min</w:t>
+        <w:t xml:space="preserve">S Charumeena  ·  about 1 min</w:t>
       </w:r>
     </w:p>
     <w:p>
@@ -2362,7 +2433,7 @@
         <w:t xml:space="preserve">Say: </w:t>
       </w:r>
       <w:r>
-        <w:t xml:space="preserve">The Flex lexer turns text into tokens with exact positions and reports bad characters as error tokens instead of crashing. The Bison parser uses LAC, lookahead correction, which makes the list of expected tokens at an error exact — here 15 tokens. The repair engine tries insert, delete and replace edits near the error using only those tokens, plus layout edits such as a semicolon at a line end. For this example it generated 60 candidates; the real parser accepted 3. Every accepted fix is written back as text with your own spacing, re-lexed and re-parsed.</w:t>
+        <w:t xml:space="preserve">The whole journey is on one page with five steps: Code, Diagnosis, Fixes, Tree, and Apply and verify. The indicator always shows where you are, what is done and what is not needed, for example Fixes is skipped for valid code. You never have to hunt through separate pages to finish one repair.</w:t>
       </w:r>
     </w:p>
     <w:p>
@@ -2377,7 +2448,7 @@
         <w:t xml:space="preserve">Technical details for the professor: </w:t>
       </w:r>
       <w:r>
-        <w:t xml:space="preserve">Window of the error token and 3 before; acceptance = full parse or ≥ 3 tokens of progress; two-edit search only if no single edit works; round-trip validation.</w:t>
+        <w:t xml:space="preserve">Step states: done / current / to do / not needed; specialist views (token table, parser state, all candidates) are linked from inside step 2.</w:t>
       </w:r>
     </w:p>
     <w:p>
@@ -2392,7 +2463,7 @@
         <w:t xml:space="preserve">Live-demo action: </w:t>
       </w:r>
       <w:r>
-        <w:t xml:space="preserve">Workspace step 2 → Compiler internals → Parser state (state 47); All candidates → Rejected tab.</w:t>
+        <w:t xml:space="preserve">Point at the step indicator.</w:t>
       </w:r>
     </w:p>
     <w:p>
@@ -2407,7 +2478,90 @@
         <w:t xml:space="preserve">Transition: </w:t>
       </w:r>
       <w:r>
-        <w:t xml:space="preserve">When several fixes parse, how does IntelliFix decide — and what if it cannot?</w:t>
+        <w:t xml:space="preserve">Step 2 answers: what did the compiler find?</w:t>
+      </w:r>
+    </w:p>
+    <w:p>
+      <w:pPr>
+        <w:pStyle w:val="Heading2"/>
+      </w:pPr>
+      <w:r>
+        <w:t xml:space="preserve">Slide 7 — Step 2 · Diagnosis: what was found, and why</w:t>
+      </w:r>
+    </w:p>
+    <w:p>
+      <w:pPr>
+        <w:spacing w:after="80" w:line="276" w:lineRule="auto"/>
+      </w:pPr>
+      <w:r>
+        <w:rPr>
+          <w:b/>
+          <w:bCs/>
+        </w:rPr>
+        <w:t xml:space="preserve">Speaker: </w:t>
+      </w:r>
+      <w:r>
+        <w:t xml:space="preserve">S Charumeena  ·  about 1 min</w:t>
+      </w:r>
+    </w:p>
+    <w:p>
+      <w:pPr>
+        <w:spacing w:after="80" w:line="276" w:lineRule="auto"/>
+      </w:pPr>
+      <w:r>
+        <w:rPr>
+          <w:b/>
+          <w:bCs/>
+        </w:rPr>
+        <w:t xml:space="preserve">Say: </w:t>
+      </w:r>
+      <w:r>
+        <w:t xml:space="preserve">The diagnosis lists every error the parser can report for this version of the code. The first one is reliable, because everything before it parsed. Later ones are labelled as likely consequences or likely independent, with the evidence, and always as likely, not proven. And it says honestly that more errors may appear once earlier ones are fixed.</w:t>
+      </w:r>
+    </w:p>
+    <w:p>
+      <w:pPr>
+        <w:spacing w:after="80" w:line="276" w:lineRule="auto"/>
+      </w:pPr>
+      <w:r>
+        <w:rPr>
+          <w:b/>
+          <w:bCs/>
+        </w:rPr>
+        <w:t xml:space="preserve">Technical details for the professor: </w:t>
+      </w:r>
+      <w:r>
+        <w:t xml:space="preserve">Roles come from a real re-parse of the best first fix; the categories (missing delimiter, ambiguous, unsupported C …) are rules over real compiler output.</w:t>
+      </w:r>
+    </w:p>
+    <w:p>
+      <w:pPr>
+        <w:spacing w:after="80" w:line="276" w:lineRule="auto"/>
+      </w:pPr>
+      <w:r>
+        <w:rPr>
+          <w:b/>
+          <w:bCs/>
+        </w:rPr>
+        <w:t xml:space="preserve">Live-demo action: </w:t>
+      </w:r>
+      <w:r>
+        <w:t xml:space="preserve">Load the several-errors example → Analyze.</w:t>
+      </w:r>
+    </w:p>
+    <w:p>
+      <w:pPr>
+        <w:spacing w:after="80" w:line="276" w:lineRule="auto"/>
+      </w:pPr>
+      <w:r>
+        <w:rPr>
+          <w:b/>
+          <w:bCs/>
+        </w:rPr>
+        <w:t xml:space="preserve">Transition: </w:t>
+      </w:r>
+      <w:r>
+        <w:t xml:space="preserve">Step 3: how fixes are found.</w:t>
       </w:r>
     </w:p>
     <w:p>
@@ -2437,10 +2591,10 @@
           <w:b/>
           <w:bCs/>
         </w:rPr>
-        <w:t xml:space="preserve">What does LAC change?</w:t>
-      </w:r>
-      <w:r>
-        <w:t xml:space="preserve"> Without it, default reductions and LALR state merging can make the expected-token list wrong; candidates are generated from that list.</w:t>
+        <w:t xml:space="preserve">How do you know an error is a consequence?</w:t>
+      </w:r>
+      <w:r>
+        <w:t xml:space="preserve"> We re-parse with only the first error fixed: if the report disappears, it was likely a consequence.</w:t>
       </w:r>
     </w:p>
     <w:p>
@@ -2448,7 +2602,7 @@
         <w:pStyle w:val="Heading2"/>
       </w:pPr>
       <w:r>
-        <w:t xml:space="preserve">Slide 6 — Interactive ambiguity resolution</w:t>
+        <w:t xml:space="preserve">Slide 8 — Step 3 · Fixes: generate, check, rank, decide</w:t>
       </w:r>
     </w:p>
     <w:p>
@@ -2478,7 +2632,7 @@
         <w:t xml:space="preserve">Say: </w:t>
       </w:r>
       <w:r>
-        <w:t xml:space="preserve">For int total = price plus semicolon, an expression is missing after the plus. The engine finds several fixes with similar evidence, so instead of guessing it asks: delete the plus, replace it, or type the missing expression yourself. It suggests price, a name declared earlier, but not total, which is still being declared. Your answer is checked by the real parser before you can apply it; applying re-analyzes the program, and Undo brings the original back. IntelliFix never invents a missing value.</w:t>
+        <w:t xml:space="preserve">Four ideas. Generate: try small insertions, deletions and replacements near the error, guided by what the grammar allows there and by layout, like a line ending without a semicolon. Check: run the real parser on every candidate and keep only real progress. Rank: group candidates that give the same program and score them with named, readable evidence. Decide: recommend only when one option clearly wins; otherwise ask.</w:t>
       </w:r>
     </w:p>
     <w:p>
@@ -2493,7 +2647,7 @@
         <w:t xml:space="preserve">Technical details for the professor: </w:t>
       </w:r>
       <w:r>
-        <w:t xml:space="preserve">Options are the decision's real top plans; placeholder edits become a fill-in box; suggestions come from lexer tokens (declared before the error, excluding the declaration in progress); validation via /api/parse.</w:t>
+        <w:t xml:space="preserve">At most two token edits per error; a budget of parser runs and time; score = sum of hand-set evidence weights, used only for ranking — not a probability.</w:t>
       </w:r>
     </w:p>
     <w:p>
@@ -2508,7 +2662,7 @@
         <w:t xml:space="preserve">Live-demo action: </w:t>
       </w:r>
       <w:r>
-        <w:t xml:space="preserve">Workspace: sample Missing expression after + → Analyze → step 3 Fixes → answer the question.</w:t>
+        <w:t xml:space="preserve">Fixes → open Why this score on a card.</w:t>
       </w:r>
     </w:p>
     <w:p>
@@ -2523,7 +2677,7 @@
         <w:t xml:space="preserve">Transition: </w:t>
       </w:r>
       <w:r>
-        <w:t xml:space="preserve">The same evidence also lets you compare repairs side by side.</w:t>
+        <w:t xml:space="preserve">With several errors, we go one error at a time.</w:t>
       </w:r>
     </w:p>
     <w:p>
@@ -2553,10 +2707,105 @@
           <w:b/>
           <w:bCs/>
         </w:rPr>
-        <w:t xml:space="preserve">Where do the options come from?</w:t>
-      </w:r>
-      <w:r>
-        <w:t xml:space="preserve"> From the repair engine's top three structurally different plans; a fill-in is the user's own text. Nothing is generated by the interface.</w:t>
+        <w:t xml:space="preserve">Is the score a probability?</w:t>
+      </w:r>
+      <w:r>
+        <w:t xml:space="preserve"> No. It ranks options; the gap between the best two decides whether to recommend or ask.</w:t>
+      </w:r>
+    </w:p>
+    <w:p>
+      <w:pPr>
+        <w:pStyle w:val="Heading2"/>
+      </w:pPr>
+      <w:r>
+        <w:t xml:space="preserve">Slide 9 — One error at a time, re-checked every time</w:t>
+      </w:r>
+    </w:p>
+    <w:p>
+      <w:pPr>
+        <w:spacing w:after="80" w:line="276" w:lineRule="auto"/>
+      </w:pPr>
+      <w:r>
+        <w:rPr>
+          <w:b/>
+          <w:bCs/>
+        </w:rPr>
+        <w:t xml:space="preserve">Speaker: </w:t>
+      </w:r>
+      <w:r>
+        <w:t xml:space="preserve">S Charumeena  ·  about 1.25 min</w:t>
+      </w:r>
+    </w:p>
+    <w:p>
+      <w:pPr>
+        <w:spacing w:after="80" w:line="276" w:lineRule="auto"/>
+      </w:pPr>
+      <w:r>
+        <w:rPr>
+          <w:b/>
+          <w:bCs/>
+        </w:rPr>
+        <w:t xml:space="preserve">Say: </w:t>
+      </w:r>
+      <w:r>
+        <w:t xml:space="preserve">With several errors we do not dump one big rewrite on the user. IntelliFix proposes a fix for the first error. You confirm it, it is applied, and the whole program is analysed again. Then you see which reports are gone, which remain, and which became visible only now, and you continue with the next error. A report whose message changed is never counted as fixed.</w:t>
+      </w:r>
+    </w:p>
+    <w:p>
+      <w:pPr>
+        <w:spacing w:after="80" w:line="276" w:lineRule="auto"/>
+      </w:pPr>
+      <w:r>
+        <w:rPr>
+          <w:b/>
+          <w:bCs/>
+        </w:rPr>
+        <w:t xml:space="preserve">Technical details for the professor: </w:t>
+      </w:r>
+      <w:r>
+        <w:t xml:space="preserve">First-error options are the engine's real candidates, trimmed to edits for that error; diagnostics are compared before/after by exact message because positions shift.</w:t>
+      </w:r>
+    </w:p>
+    <w:p>
+      <w:pPr>
+        <w:spacing w:after="80" w:line="276" w:lineRule="auto"/>
+      </w:pPr>
+      <w:r>
+        <w:rPr>
+          <w:b/>
+          <w:bCs/>
+        </w:rPr>
+        <w:t xml:space="preserve">Live-demo action: </w:t>
+      </w:r>
+      <w:r>
+        <w:t xml:space="preserve">Use this fix → Apply &amp; verify → Apply → Fix the next error.</w:t>
+      </w:r>
+    </w:p>
+    <w:p>
+      <w:pPr>
+        <w:spacing w:after="80" w:line="276" w:lineRule="auto"/>
+      </w:pPr>
+      <w:r>
+        <w:rPr>
+          <w:b/>
+          <w:bCs/>
+        </w:rPr>
+        <w:t xml:space="preserve">Transition: </w:t>
+      </w:r>
+      <w:r>
+        <w:t xml:space="preserve">Sometimes the code alone cannot tell us what was meant.</w:t>
+      </w:r>
+    </w:p>
+    <w:p>
+      <w:pPr>
+        <w:spacing w:after="40" w:before="60"/>
+      </w:pPr>
+      <w:r>
+        <w:rPr>
+          <w:b/>
+          <w:bCs/>
+        </w:rPr>
+        <w:t xml:space="preserve">Likely questions</w:t>
       </w:r>
     </w:p>
     <w:p>
@@ -2574,10 +2823,10 @@
           <w:b/>
           <w:bCs/>
         </w:rPr>
-        <w:t xml:space="preserve">What if the user picks something wrong?</w:t>
-      </w:r>
-      <w:r>
-        <w:t xml:space="preserve"> The parser check shows whether it parses; name warnings may flag an undeclared name; Undo restores the original.</w:t>
+        <w:t xml:space="preserve">Why not fix everything at once?</w:t>
+      </w:r>
+      <w:r>
+        <w:t xml:space="preserve"> A combined plan can hide a destructive edit for a later error; one at a time keeps each decision visible. The complete plan is still available, with warnings.</w:t>
       </w:r>
     </w:p>
     <w:p>
@@ -2585,7 +2834,7 @@
         <w:pStyle w:val="Heading2"/>
       </w:pPr>
       <w:r>
-        <w:t xml:space="preserve">Slide 7 — Explainable repair comparison</w:t>
+        <w:t xml:space="preserve">Slide 10 — Asking instead of guessing</w:t>
       </w:r>
     </w:p>
     <w:p>
@@ -2615,7 +2864,7 @@
         <w:t xml:space="preserve">Say: </w:t>
       </w:r>
       <w:r>
-        <w:t xml:space="preserve">Each accepted candidate gets a score from 13 named pieces of evidence. Inserting the semicolon costs minus one, makes the whole program parse, plus two, and lands exactly at a line break, plus 0.75: total 1.75. Replacing int with a comma costs more and overwrites a keyword you wrote: minus 0.25. The best leads by 2.0, above our threshold of 1.5, so it is recommended. The score only ranks; it is not a probability, and parsing does not prove the meaning is right.</w:t>
+        <w:t xml:space="preserve">Here the plus sign has nothing after it. Delete it, or add a value? Both parse, and they mean different programs. So IntelliFix asks a short question in plain words, offers the real alternatives, lets you type your own value, and checks your answer with the real parser before you can use it. It never invents the missing value.</w:t>
       </w:r>
     </w:p>
     <w:p>
@@ -2630,7 +2879,7 @@
         <w:t xml:space="preserve">Technical details for the professor: </w:t>
       </w:r>
       <w:r>
-        <w:t xml:space="preserve">Weights set on the development split and frozen before testing; candidates with the same canonical AST form one class; margin = best class − second class; τ = 1.5 chosen on dev.</w:t>
+        <w:t xml:space="preserve">Questions are built from the shape of the real candidates (missing operand, missing operator, invalid character, missing name). Suggestions are only names already declared earlier.</w:t>
       </w:r>
     </w:p>
     <w:p>
@@ -2645,7 +2894,7 @@
         <w:t xml:space="preserve">Live-demo action: </w:t>
       </w:r>
       <w:r>
-        <w:t xml:space="preserve">Workspace step 3 Fixes → option cards → Why this score; Compiler internals → All candidates for the full evidence.</w:t>
+        <w:t xml:space="preserve">price + ; → answer the question with price → Check with the parser.</w:t>
       </w:r>
     </w:p>
     <w:p>
@@ -2660,7 +2909,90 @@
         <w:t xml:space="preserve">Transition: </w:t>
       </w:r>
       <w:r>
-        <w:t xml:space="preserve">Next, the structure itself: the AST.</w:t>
+        <w:t xml:space="preserve">Parsing is not the same as meaning what you wanted.</w:t>
+      </w:r>
+    </w:p>
+    <w:p>
+      <w:pPr>
+        <w:pStyle w:val="Heading2"/>
+      </w:pPr>
+      <w:r>
+        <w:t xml:space="preserve">Slide 11 — Safe repairs: parsing is not meaning</w:t>
+      </w:r>
+    </w:p>
+    <w:p>
+      <w:pPr>
+        <w:spacing w:after="80" w:line="276" w:lineRule="auto"/>
+      </w:pPr>
+      <w:r>
+        <w:rPr>
+          <w:b/>
+          <w:bCs/>
+        </w:rPr>
+        <w:t xml:space="preserve">Speaker: </w:t>
+      </w:r>
+      <w:r>
+        <w:t xml:space="preserve">S Charumeena  ·  about 1.25 min</w:t>
+      </w:r>
+    </w:p>
+    <w:p>
+      <w:pPr>
+        <w:spacing w:after="80" w:line="276" w:lineRule="auto"/>
+      </w:pPr>
+      <w:r>
+        <w:rPr>
+          <w:b/>
+          <w:bCs/>
+        </w:rPr>
+        <w:t xml:space="preserve">Say: </w:t>
+      </w:r>
+      <w:r>
+        <w:t xml:space="preserve">A repair can parse and still destroy the program: deleting the plus and the increment makes the code valid but wrong. So any edit that removes an operator, a name, a value or a statement is labelled as removing code and is never shown as recommended. For unsupported C like plus-plus, IntelliFix explains the limit and offers the supported rewrite, total equals total plus one, checked by the parser.</w:t>
+      </w:r>
+    </w:p>
+    <w:p>
+      <w:pPr>
+        <w:spacing w:after="80" w:line="276" w:lineRule="auto"/>
+      </w:pPr>
+      <w:r>
+        <w:rPr>
+          <w:b/>
+          <w:bCs/>
+        </w:rPr>
+        <w:t xml:space="preserve">Technical details for the professor: </w:t>
+      </w:r>
+      <w:r>
+        <w:t xml:space="preserve">Punctuation-only fixes, such as a missing semicolon, are still recommended. Rewrites cover simple statements (x++; --x; x += e;).</w:t>
+      </w:r>
+    </w:p>
+    <w:p>
+      <w:pPr>
+        <w:spacing w:after="80" w:line="276" w:lineRule="auto"/>
+      </w:pPr>
+      <w:r>
+        <w:rPr>
+          <w:b/>
+          <w:bCs/>
+        </w:rPr>
+        <w:t xml:space="preserve">Live-demo action: </w:t>
+      </w:r>
+      <w:r>
+        <w:t xml:space="preserve">Show the complete-plan warning and the ++ rewrite.</w:t>
+      </w:r>
+    </w:p>
+    <w:p>
+      <w:pPr>
+        <w:spacing w:after="80" w:line="276" w:lineRule="auto"/>
+      </w:pPr>
+      <w:r>
+        <w:rPr>
+          <w:b/>
+          <w:bCs/>
+        </w:rPr>
+        <w:t xml:space="preserve">Transition: </w:t>
+      </w:r>
+      <w:r>
+        <w:t xml:space="preserve">Step 4 shows the effect on the structure.</w:t>
       </w:r>
     </w:p>
     <w:p>
@@ -2690,10 +3022,105 @@
           <w:b/>
           <w:bCs/>
         </w:rPr>
-        <w:t xml:space="preserve">How were the weights chosen?</w:t>
-      </w:r>
-      <w:r>
-        <w:t xml:space="preserve"> By hand on the 360-case development split only, then frozen; the test split was used once.</w:t>
+        <w:t xml:space="preserve">Do you just reject all deletions?</w:t>
+      </w:r>
+      <w:r>
+        <w:t xml:space="preserve"> No. Deleting a stray semicolon is safe; deleting an operator or name changes meaning, so it needs an informed choice.</w:t>
+      </w:r>
+    </w:p>
+    <w:p>
+      <w:pPr>
+        <w:pStyle w:val="Heading2"/>
+      </w:pPr>
+      <w:r>
+        <w:t xml:space="preserve">Slide 12 — Step 4 · The tree: what a fix changes</w:t>
+      </w:r>
+    </w:p>
+    <w:p>
+      <w:pPr>
+        <w:spacing w:after="80" w:line="276" w:lineRule="auto"/>
+      </w:pPr>
+      <w:r>
+        <w:rPr>
+          <w:b/>
+          <w:bCs/>
+        </w:rPr>
+        <w:t xml:space="preserve">Speaker: </w:t>
+      </w:r>
+      <w:r>
+        <w:t xml:space="preserve">Raguraman Govindasamy  ·  about 1 min</w:t>
+      </w:r>
+    </w:p>
+    <w:p>
+      <w:pPr>
+        <w:spacing w:after="80" w:line="276" w:lineRule="auto"/>
+      </w:pPr>
+      <w:r>
+        <w:rPr>
+          <w:b/>
+          <w:bCs/>
+        </w:rPr>
+        <w:t xml:space="preserve">Say: </w:t>
+      </w:r>
+      <w:r>
+        <w:t xml:space="preserve">Code with errors only has a partial tree, and we label it that way: the skipped part is an Error node, nothing is invented. After a fix we show the complete tree and exactly which part changed. In the AST Explorer, clicking a node highlights its code, clicking code finds its node, and each node shows the grammar rule that built it and, for expressions, a small diagram of how operators group.</w:t>
+      </w:r>
+    </w:p>
+    <w:p>
+      <w:pPr>
+        <w:spacing w:after="80" w:line="276" w:lineRule="auto"/>
+      </w:pPr>
+      <w:r>
+        <w:rPr>
+          <w:b/>
+          <w:bCs/>
+        </w:rPr>
+        <w:t xml:space="preserve">Technical details for the professor: </w:t>
+      </w:r>
+      <w:r>
+        <w:t xml:space="preserve">Partial trees come from Bison's panic-mode recovery; before/after uses a structural diff of the two real trees.</w:t>
+      </w:r>
+    </w:p>
+    <w:p>
+      <w:pPr>
+        <w:spacing w:after="80" w:line="276" w:lineRule="auto"/>
+      </w:pPr>
+      <w:r>
+        <w:rPr>
+          <w:b/>
+          <w:bCs/>
+        </w:rPr>
+        <w:t xml:space="preserve">Live-demo action: </w:t>
+      </w:r>
+      <w:r>
+        <w:t xml:space="preserve">AST Explorer → click Binary + → click a ; in the code.</w:t>
+      </w:r>
+    </w:p>
+    <w:p>
+      <w:pPr>
+        <w:spacing w:after="80" w:line="276" w:lineRule="auto"/>
+      </w:pPr>
+      <w:r>
+        <w:rPr>
+          <w:b/>
+          <w:bCs/>
+        </w:rPr>
+        <w:t xml:space="preserve">Transition: </w:t>
+      </w:r>
+      <w:r>
+        <w:t xml:space="preserve">Step 5: when is the program really done?</w:t>
+      </w:r>
+    </w:p>
+    <w:p>
+      <w:pPr>
+        <w:spacing w:after="40" w:before="60"/>
+      </w:pPr>
+      <w:r>
+        <w:rPr>
+          <w:b/>
+          <w:bCs/>
+        </w:rPr>
+        <w:t xml:space="preserve">Likely questions</w:t>
       </w:r>
     </w:p>
     <w:p>
@@ -2711,10 +3138,10 @@
           <w:b/>
           <w:bCs/>
         </w:rPr>
-        <w:t xml:space="preserve">Is the margin a confidence?</w:t>
-      </w:r>
-      <w:r>
-        <w:t xml:space="preserve"> No — a score difference used for abstention; no calibration is claimed.</w:t>
+        <w:t xml:space="preserve">Is a partial tree trustworthy?</w:t>
+      </w:r>
+      <w:r>
+        <w:t xml:space="preserve"> It shows what was understood; it is never presented as a valid program's tree.</w:t>
       </w:r>
     </w:p>
     <w:p>
@@ -2722,7 +3149,7 @@
         <w:pStyle w:val="Heading2"/>
       </w:pPr>
       <w:r>
-        <w:t xml:space="preserve">Slide 8 — A detailed AST explorer</w:t>
+        <w:t xml:space="preserve">Slide 13 — Step 5 · Verify, and finish honestly</w:t>
       </w:r>
     </w:p>
     <w:p>
@@ -2737,7 +3164,7 @@
         <w:t xml:space="preserve">Speaker: </w:t>
       </w:r>
       <w:r>
-        <w:t xml:space="preserve">S Charumeena  ·  about 1.25 min</w:t>
+        <w:t xml:space="preserve">Raguraman Govindasamy  ·  about 1 min</w:t>
       </w:r>
     </w:p>
     <w:p>
@@ -2752,7 +3179,7 @@
         <w:t xml:space="preserve">Say: </w:t>
       </w:r>
       <w:r>
-        <w:t xml:space="preserve">Our professor asked for an AST that beginners can understand, so every node explains itself. Click a node and you see what it represents, a plain-English sentence — here “the operator times multiplies its left and right values” — its role in its parent, what each child means, the exact source code it came from, highlighted in the editor, and what changed after a repair. You can search the tree and expand or collapse it. Everything comes from the compiler's real AST.</w:t>
+        <w:t xml:space="preserve">IntelliFix only says done when the latest code passes every check it really performs: the lexer, the parser and the name check. The summary lists the corrections made and also what it does not check: types, run-time behaviour and code generation. A misspelt variable name keeps the program from being called complete, even though the syntax is fine.</w:t>
       </w:r>
     </w:p>
     <w:p>
@@ -2767,7 +3194,7 @@
         <w:t xml:space="preserve">Technical details for the professor: </w:t>
       </w:r>
       <w:r>
-        <w:t xml:space="preserve">AST from Bison actions (arena, canonical form, FNV-1a hash); explanations for all 26 node kinds; source spans in UTF-8 byte offsets mapped to the editor.</w:t>
+        <w:t xml:space="preserve">Name check: undeclared, duplicate, misused names and argument counts. Undo restores any earlier version and re-analyses it.</w:t>
       </w:r>
     </w:p>
     <w:p>
@@ -2782,7 +3209,7 @@
         <w:t xml:space="preserve">Live-demo action: </w:t>
       </w:r>
       <w:r>
-        <w:t xml:space="preserve">AST Explorer → click the Binary + node, then click a ; in the code; search for square.</w:t>
+        <w:t xml:space="preserve">Last fix → completion summary.</w:t>
       </w:r>
     </w:p>
     <w:p>
@@ -2797,7 +3224,7 @@
         <w:t xml:space="preserve">Transition: </w:t>
       </w:r>
       <w:r>
-        <w:t xml:space="preserve">What happens to the tree when the code is broken, or after a repair?</w:t>
+        <w:t xml:space="preserve">Briefly, what the measurements say.</w:t>
       </w:r>
     </w:p>
     <w:p>
@@ -2827,10 +3254,10 @@
           <w:b/>
           <w:bCs/>
         </w:rPr>
-        <w:t xml:space="preserve">Is this a parse tree?</w:t>
-      </w:r>
-      <w:r>
-        <w:t xml:space="preserve"> No: the AST drops tokens with no meaning, such as parentheses and semicolons; the parser view shows the parse steps.</w:t>
+        <w:t xml:space="preserve">Does it prove my program is correct?</w:t>
+      </w:r>
+      <w:r>
+        <w:t xml:space="preserve"> No — it proves it passes these syntax and name checks.</w:t>
       </w:r>
     </w:p>
     <w:p>
@@ -2838,7 +3265,7 @@
         <w:pStyle w:val="Heading2"/>
       </w:pPr>
       <w:r>
-        <w:t xml:space="preserve">Slide 9 — Before and after a repair</w:t>
+        <w:t xml:space="preserve">Slide 14 — Research in brief</w:t>
       </w:r>
     </w:p>
     <w:p>
@@ -2853,7 +3280,7 @@
         <w:t xml:space="preserve">Speaker: </w:t>
       </w:r>
       <w:r>
-        <w:t xml:space="preserve">S Charumeena  ·  about 1 min</w:t>
+        <w:t xml:space="preserve">Raguraman Govindasamy  ·  about 1 min</w:t>
       </w:r>
     </w:p>
     <w:p>
@@ -2868,7 +3295,7 @@
         <w:t xml:space="preserve">Say: </w:t>
       </w:r>
       <w:r>
-        <w:t xml:space="preserve">Code with a syntax error has no complete AST, and we do not fake one: the explorer shows the partial tree the parser built while recovering, with Error nodes where it skipped text, and clearly labelled. It can also show the real AST of the top-ranked repair. To compare structures, both programs are parsed again; here, plan 1 inserts plus and plan 2 inserts minus, and the comparison marks exactly one changed node: the Binary operator.</w:t>
+        <w:t xml:space="preserve">We also asked one research question: does ranking by evidence and abstaining when unsure beat simply taking the cheapest edit? On a synthetic benchmark, yes: the top fix matched the intended program clearly more often, and asking instead of guessing cut confident mistakes sharply. The benchmark is synthetic and there is no user study yet, so we present this as supporting evidence, not as proof.</w:t>
       </w:r>
     </w:p>
     <w:p>
@@ -2883,7 +3310,7 @@
         <w:t xml:space="preserve">Technical details for the professor: </w:t>
       </w:r>
       <w:r>
-        <w:t xml:space="preserve">Structural diff aligns children by LCS over canonical subtrees; marks only where kind and span match; no diff is claimed when either side is invalid.</w:t>
+        <w:t xml:space="preserve">Held-out synthetic test set (mutations of 30 hand-written programs): top-1 71.5% vs 55.2% for least-cost repair; wrong-but-confident 28.5% → 6.1%. Details on the Research &amp; Method page.</w:t>
       </w:r>
     </w:p>
     <w:p>
@@ -2898,7 +3325,7 @@
         <w:t xml:space="preserve">Live-demo action: </w:t>
       </w:r>
       <w:r>
-        <w:t xml:space="preserve">Ambiguous operator sample → Analyze → AST Explorer → Before &amp; after.</w:t>
+        <w:t xml:space="preserve">Research &amp; Method page (optional).</w:t>
       </w:r>
     </w:p>
     <w:p>
@@ -2913,7 +3340,7 @@
         <w:t xml:space="preserve">Transition: </w:t>
       </w:r>
       <w:r>
-        <w:t xml:space="preserve">All of this is wrapped in explanations for beginners.</w:t>
+        <w:t xml:space="preserve">Limits and what comes next.</w:t>
       </w:r>
     </w:p>
     <w:p>
@@ -2943,10 +3370,10 @@
           <w:b/>
           <w:bCs/>
         </w:rPr>
-        <w:t xml:space="preserve">Why not show the AST of invalid code?</w:t>
-      </w:r>
-      <w:r>
-        <w:t xml:space="preserve"> There is none; the recovered tree is labelled partial because recovery may not match the programmer's intent.</w:t>
+        <w:t xml:space="preserve">Better than CPCT+?</w:t>
+      </w:r>
+      <w:r>
+        <w:t xml:space="preserve"> We make no general claim; it optimises a different objective.</w:t>
       </w:r>
     </w:p>
     <w:p>
@@ -2954,7 +3381,7 @@
         <w:pStyle w:val="Heading2"/>
       </w:pPr>
       <w:r>
-        <w:t xml:space="preserve">Slide 10 — Explanations and guided repair</w:t>
+        <w:t xml:space="preserve">Slide 15 — Limits and next steps</w:t>
       </w:r>
     </w:p>
     <w:p>
@@ -2969,7 +3396,7 @@
         <w:t xml:space="preserve">Speaker: </w:t>
       </w:r>
       <w:r>
-        <w:t xml:space="preserve">S Charumeena  ·  about 1.25 min</w:t>
+        <w:t xml:space="preserve">All three (driver, narrator, checker)  ·  about 1 min</w:t>
       </w:r>
     </w:p>
     <w:p>
@@ -2984,7 +3411,7 @@
         <w:t xml:space="preserve">Say: </w:t>
       </w:r>
       <w:r>
-        <w:t xml:space="preserve">Every analysis starts with a plain-language answer. For a valid program it summarises what the program contains and says that valid syntax does not mean correct behaviour. For errors it says where the parser stopped, what MiniC expects there in words, and why the cause may be on an earlier line. When there are several errors it explains which report to trust first. Students can ask for hints step by step — where, then what is expected, then the possible fixes — and try their own fix; the real compiler checks it.</w:t>
+        <w:t xml:space="preserve">Honest limits: MiniC is a teaching subset of C, IntelliFix checks syntax and names but not types or behaviour, and the evaluation is synthetic. Next: real student errors, a user study of the question-and-answer flow, and type checking. Thank you — you are welcome to type your own code.</w:t>
       </w:r>
     </w:p>
     <w:p>
@@ -2999,7 +3426,7 @@
         <w:t xml:space="preserve">Technical details for the professor: </w:t>
       </w:r>
       <w:r>
-        <w:t xml:space="preserve">Explanations are pure functions over the compiler response; tested on all 88 professor-style inputs (102 unit tests); every result state has its own wording, including empty input, unsupported C and the nesting limit.</w:t>
+        <w:t xml:space="preserve">Tested on Linux in Chromium; Windows and macOS not verified.</w:t>
       </w:r>
     </w:p>
     <w:p>
@@ -3014,7 +3441,7 @@
         <w:t xml:space="preserve">Live-demo action: </w:t>
       </w:r>
       <w:r>
-        <w:t xml:space="preserve">Workspace: int x = 1 (no ;) → Analyze → Show a hint ×3 → I'll try it → type ; → Check my fix.</w:t>
+        <w:t xml:space="preserve">Workspace cleared, ready for questions.</w:t>
       </w:r>
     </w:p>
     <w:p>
@@ -3029,601 +3456,15 @@
         <w:t xml:space="preserve">Transition: </w:t>
       </w:r>
       <w:r>
-        <w:t xml:space="preserve">Raguraman will now show how we measured the system.</w:t>
-      </w:r>
-    </w:p>
-    <w:p>
-      <w:pPr>
-        <w:spacing w:after="40" w:before="60"/>
-      </w:pPr>
-      <w:r>
-        <w:rPr>
-          <w:b/>
-          <w:bCs/>
-        </w:rPr>
-        <w:t xml:space="preserve">Likely questions</w:t>
-      </w:r>
-    </w:p>
-    <w:p>
-      <w:pPr>
-        <w:pStyle w:val="ListParagraph"/>
-        <w:numPr>
-          <w:ilvl w:val="0"/>
-          <w:numId w:val="2"/>
-        </w:numPr>
-        <w:spacing w:after="60" w:line="276" w:lineRule="auto"/>
-        <w:jc w:val="left"/>
-      </w:pPr>
-      <w:r>
-        <w:rPr>
-          <w:b/>
-          <w:bCs/>
-        </w:rPr>
-        <w:t xml:space="preserve">Are the explanations generated by AI?</w:t>
-      </w:r>
-      <w:r>
-        <w:t xml:space="preserve"> No; they are written rules over the real diagnostics, expected-token sets and repair plans, so they are deterministic and testable.</w:t>
-      </w:r>
-    </w:p>
-    <w:p>
-      <w:pPr>
-        <w:pStyle w:val="Heading2"/>
-      </w:pPr>
-      <w:r>
-        <w:t xml:space="preserve">Slide 11 — Method and verified results</w:t>
-      </w:r>
-    </w:p>
-    <w:p>
-      <w:pPr>
-        <w:spacing w:after="80" w:line="276" w:lineRule="auto"/>
-      </w:pPr>
-      <w:r>
-        <w:rPr>
-          <w:b/>
-          <w:bCs/>
-        </w:rPr>
-        <w:t xml:space="preserve">Speaker: </w:t>
-      </w:r>
-      <w:r>
-        <w:t xml:space="preserve">Raguraman Govindasamy  ·  about 1.5 min</w:t>
-      </w:r>
-    </w:p>
-    <w:p>
-      <w:pPr>
-        <w:spacing w:after="80" w:line="276" w:lineRule="auto"/>
-      </w:pPr>
-      <w:r>
-        <w:rPr>
-          <w:b/>
-          <w:bCs/>
-        </w:rPr>
-        <w:t xml:space="preserve">Say: </w:t>
-      </w:r>
-      <w:r>
-        <w:t xml:space="preserve">We wrote 30 valid MiniC programs and generated 900 seeded mutations with one or two errors. We split by program: 360 cases for development and 540 held out for testing, so near-duplicates cannot leak. On the test set the top-ranked repair restored the original program's syntax tree in 71.5 percent of cases, against 55.2 percent for a least-cost repair over the same candidates, and about 48 percent for CPCT+. The first edit was at the exact mistake in 86.7 percent of cases. These are synthetic errors, not real student code.</w:t>
-      </w:r>
-    </w:p>
-    <w:p>
-      <w:pPr>
-        <w:spacing w:after="80" w:line="276" w:lineRule="auto"/>
-      </w:pPr>
-      <w:r>
-        <w:rPr>
-          <w:b/>
-          <w:bCs/>
-        </w:rPr>
-        <w:t xml:space="preserve">Technical details for the professor: </w:t>
-      </w:r>
-      <w:r>
-        <w:t xml:space="preserve">Top-1 71.5% [67.5, 75.1]; paired difference vs least-cost +16.3 points [13.1, 19.4]; CPCT+ 47.4–49.1% over three runs (non-deterministic ties); Wilson intervals, paired bootstrap.</w:t>
-      </w:r>
-    </w:p>
-    <w:p>
-      <w:pPr>
-        <w:spacing w:after="80" w:line="276" w:lineRule="auto"/>
-      </w:pPr>
-      <w:r>
-        <w:rPr>
-          <w:b/>
-          <w:bCs/>
-        </w:rPr>
-        <w:t xml:space="preserve">Live-demo action: </w:t>
-      </w:r>
-      <w:r>
-        <w:t xml:space="preserve">Research &amp; Method → sections 3–4.</w:t>
-      </w:r>
-    </w:p>
-    <w:p>
-      <w:pPr>
-        <w:spacing w:after="80" w:line="276" w:lineRule="auto"/>
-      </w:pPr>
-      <w:r>
-        <w:rPr>
-          <w:b/>
-          <w:bCs/>
-        </w:rPr>
-        <w:t xml:space="preserve">Transition: </w:t>
-      </w:r>
-      <w:r>
-        <w:t xml:space="preserve">Just as important: what helped, and what did not.</w:t>
-      </w:r>
-    </w:p>
-    <w:p>
-      <w:pPr>
-        <w:spacing w:after="40" w:before="60"/>
-      </w:pPr>
-      <w:r>
-        <w:rPr>
-          <w:b/>
-          <w:bCs/>
-        </w:rPr>
-        <w:t xml:space="preserve">Likely questions</w:t>
-      </w:r>
-    </w:p>
-    <w:p>
-      <w:pPr>
-        <w:pStyle w:val="ListParagraph"/>
-        <w:numPr>
-          <w:ilvl w:val="0"/>
-          <w:numId w:val="2"/>
-        </w:numPr>
-        <w:spacing w:after="60" w:line="276" w:lineRule="auto"/>
-        <w:jc w:val="left"/>
-      </w:pPr>
-      <w:r>
-        <w:rPr>
-          <w:b/>
-          <w:bCs/>
-        </w:rPr>
-        <w:t xml:space="preserve">Are you better than CPCT+?</w:t>
-      </w:r>
-      <w:r>
-        <w:t xml:space="preserve"> Only at one thing we measured — whether the first repair restores the original program. CPCT+ was designed for recovery, which we did not measure.</w:t>
-      </w:r>
-    </w:p>
-    <w:p>
-      <w:pPr>
-        <w:pStyle w:val="Heading2"/>
-      </w:pPr>
-      <w:r>
-        <w:t xml:space="preserve">Slide 12 — Ablations and negative results</w:t>
-      </w:r>
-    </w:p>
-    <w:p>
-      <w:pPr>
-        <w:spacing w:after="80" w:line="276" w:lineRule="auto"/>
-      </w:pPr>
-      <w:r>
-        <w:rPr>
-          <w:b/>
-          <w:bCs/>
-        </w:rPr>
-        <w:t xml:space="preserve">Speaker: </w:t>
-      </w:r>
-      <w:r>
-        <w:t xml:space="preserve">Raguraman Govindasamy  ·  about 1.25 min</w:t>
-      </w:r>
-    </w:p>
-    <w:p>
-      <w:pPr>
-        <w:spacing w:after="80" w:line="276" w:lineRule="auto"/>
-      </w:pPr>
-      <w:r>
-        <w:rPr>
-          <w:b/>
-          <w:bCs/>
-        </w:rPr>
-        <w:t xml:space="preserve">Say: </w:t>
-      </w:r>
-      <w:r>
-        <w:t xml:space="preserve">Removing layout evidence drops accuracy from 71.5 to 62.6 percent, so layout matters. Abstention cuts wrong answers presented as confident from 28.5 to 6.1 percent of all cases, while still recommending in 50.7 percent; of those recommendations 88 percent were correct. But the stability evidence gave no measurable gain, grouping helped only a little, and our risk target was missed: 12 percent instead of 10. For the new question feature we only have a simulation: when IntelliFix abstains, the correct repair is among the offered options in 153 of 256 cases. Real usability is not yet measured.</w:t>
-      </w:r>
-    </w:p>
-    <w:p>
-      <w:pPr>
-        <w:spacing w:after="80" w:line="276" w:lineRule="auto"/>
-      </w:pPr>
-      <w:r>
-        <w:rPr>
-          <w:b/>
-          <w:bCs/>
-        </w:rPr>
-        <w:t xml:space="preserve">Technical details for the professor: </w:t>
-      </w:r>
-      <w:r>
-        <w:t xml:space="preserve">Stability +0.2 points, CI [−0.4, 0.9]; grouping coverage 50.7% vs 48.9%; clarification bound from stored top-3 results (evaluation/experiments/clarification_bound.py), labelled as simulation.</w:t>
-      </w:r>
-    </w:p>
-    <w:p>
-      <w:pPr>
-        <w:spacing w:after="80" w:line="276" w:lineRule="auto"/>
-      </w:pPr>
-      <w:r>
-        <w:rPr>
-          <w:b/>
-          <w:bCs/>
-        </w:rPr>
-        <w:t xml:space="preserve">Live-demo action: </w:t>
-      </w:r>
-      <w:r>
-        <w:t xml:space="preserve">Research &amp; Method → section 5 (ablation) and 6 (limitations).</w:t>
-      </w:r>
-    </w:p>
-    <w:p>
-      <w:pPr>
-        <w:spacing w:after="80" w:line="276" w:lineRule="auto"/>
-      </w:pPr>
-      <w:r>
-        <w:rPr>
-          <w:b/>
-          <w:bCs/>
-        </w:rPr>
-        <w:t xml:space="preserve">Transition: </w:t>
-      </w:r>
-      <w:r>
-        <w:t xml:space="preserve">How do we know it behaves on unexpected input?</w:t>
-      </w:r>
-    </w:p>
-    <w:p>
-      <w:pPr>
-        <w:spacing w:after="40" w:before="60"/>
-      </w:pPr>
-      <w:r>
-        <w:rPr>
-          <w:b/>
-          <w:bCs/>
-        </w:rPr>
-        <w:t xml:space="preserve">Likely questions</w:t>
-      </w:r>
-    </w:p>
-    <w:p>
-      <w:pPr>
-        <w:pStyle w:val="ListParagraph"/>
-        <w:numPr>
-          <w:ilvl w:val="0"/>
-          <w:numId w:val="2"/>
-        </w:numPr>
-        <w:spacing w:after="60" w:line="276" w:lineRule="auto"/>
-        <w:jc w:val="left"/>
-      </w:pPr>
-      <w:r>
-        <w:rPr>
-          <w:b/>
-          <w:bCs/>
-        </w:rPr>
-        <w:t xml:space="preserve">Why report negative results?</w:t>
-      </w:r>
-      <w:r>
-        <w:t xml:space="preserve"> They show which parts actually work, and they keep the claims honest.</w:t>
-      </w:r>
-    </w:p>
-    <w:p>
-      <w:pPr>
-        <w:pStyle w:val="ListParagraph"/>
-        <w:numPr>
-          <w:ilvl w:val="0"/>
-          <w:numId w:val="2"/>
-        </w:numPr>
-        <w:spacing w:after="60" w:line="276" w:lineRule="auto"/>
-        <w:jc w:val="left"/>
-      </w:pPr>
-      <w:r>
-        <w:rPr>
-          <w:b/>
-          <w:bCs/>
-        </w:rPr>
-        <w:t xml:space="preserve">Did the new interface change the numbers?</w:t>
-      </w:r>
-      <w:r>
-        <w:t xml:space="preserve"> No: the compiler and repair engine were not changed for the interface features, so the stored evaluation still describes the system.</w:t>
-      </w:r>
-    </w:p>
-    <w:p>
-      <w:pPr>
-        <w:pStyle w:val="Heading2"/>
-      </w:pPr>
-      <w:r>
-        <w:t xml:space="preserve">Slide 13 — Testing, limits and platforms</w:t>
-      </w:r>
-    </w:p>
-    <w:p>
-      <w:pPr>
-        <w:spacing w:after="80" w:line="276" w:lineRule="auto"/>
-      </w:pPr>
-      <w:r>
-        <w:rPr>
-          <w:b/>
-          <w:bCs/>
-        </w:rPr>
-        <w:t xml:space="preserve">Speaker: </w:t>
-      </w:r>
-      <w:r>
-        <w:t xml:space="preserve">Raguraman Govindasamy  ·  about 1.25 min</w:t>
-      </w:r>
-    </w:p>
-    <w:p>
-      <w:pPr>
-        <w:spacing w:after="80" w:line="276" w:lineRule="auto"/>
-      </w:pPr>
-      <w:r>
-        <w:rPr>
-          <w:b/>
-          <w:bCs/>
-        </w:rPr>
-        <w:t xml:space="preserve">Say: </w:t>
-      </w:r>
-      <w:r>
-        <w:t xml:space="preserve">We have C++ unit tests, API tests, evaluation tests, frontend tests and real-browser end-to-end tests, all passing. A professor-style suite of 88 unfamiliar inputs and 800 random inputs checks that nothing crashes and every claim of validity is a real parse; it found and we fixed two real defects. Limits: synthetic errors, one author's programs, a C subset, syntax only, and two known confident but unintended repairs. Linux is fully tested; the Windows build passed its tests under Wine, but has not been run on a real Windows machine yet.</w:t>
-      </w:r>
-    </w:p>
-    <w:p>
-      <w:pPr>
-        <w:spacing w:after="80" w:line="276" w:lineRule="auto"/>
-      </w:pPr>
-      <w:r>
-        <w:rPr>
-          <w:b/>
-          <w:bCs/>
-        </w:rPr>
-        <w:t xml:space="preserve">Technical details for the professor: </w:t>
-      </w:r>
-      <w:r>
-        <w:t xml:space="preserve">Test counts from the final run are on the slide; Windows: MinGW cross-build + Wine 68/68; MSVC and PowerShell scripts not executed.</w:t>
-      </w:r>
-    </w:p>
-    <w:p>
-      <w:pPr>
-        <w:spacing w:after="80" w:line="276" w:lineRule="auto"/>
-      </w:pPr>
-      <w:r>
-        <w:rPr>
-          <w:b/>
-          <w:bCs/>
-        </w:rPr>
-        <w:t xml:space="preserve">Transition: </w:t>
-      </w:r>
-      <w:r>
-        <w:t xml:space="preserve">Now let us show it live.</w:t>
-      </w:r>
-    </w:p>
-    <w:p>
-      <w:pPr>
-        <w:spacing w:after="40" w:before="60"/>
-      </w:pPr>
-      <w:r>
-        <w:rPr>
-          <w:b/>
-          <w:bCs/>
-        </w:rPr>
-        <w:t xml:space="preserve">Likely questions</w:t>
-      </w:r>
-    </w:p>
-    <w:p>
-      <w:pPr>
-        <w:pStyle w:val="ListParagraph"/>
-        <w:numPr>
-          <w:ilvl w:val="0"/>
-          <w:numId w:val="2"/>
-        </w:numPr>
-        <w:spacing w:after="60" w:line="276" w:lineRule="auto"/>
-        <w:jc w:val="left"/>
-      </w:pPr>
-      <w:r>
-        <w:rPr>
-          <w:b/>
-          <w:bCs/>
-        </w:rPr>
-        <w:t xml:space="preserve">What breaks it?</w:t>
-      </w:r>
-      <w:r>
-        <w:t xml:space="preserve"> Errors needing three or more edits at one place, very distant causes, and valid-but-wrong fixes like whlie (…) { receiving a semicolon.</w:t>
-      </w:r>
-    </w:p>
-    <w:p>
-      <w:pPr>
-        <w:pStyle w:val="Heading2"/>
-      </w:pPr>
-      <w:r>
-        <w:t xml:space="preserve">Slide 14 — Live demo</w:t>
-      </w:r>
-    </w:p>
-    <w:p>
-      <w:pPr>
-        <w:spacing w:after="80" w:line="276" w:lineRule="auto"/>
-      </w:pPr>
-      <w:r>
-        <w:rPr>
-          <w:b/>
-          <w:bCs/>
-        </w:rPr>
-        <w:t xml:space="preserve">Speaker: </w:t>
-      </w:r>
-      <w:r>
-        <w:t xml:space="preserve">All three (driver, narrator, checker)  ·  about 6 min</w:t>
-      </w:r>
-    </w:p>
-    <w:p>
-      <w:pPr>
-        <w:spacing w:after="80" w:line="276" w:lineRule="auto"/>
-      </w:pPr>
-      <w:r>
-        <w:rPr>
-          <w:b/>
-          <w:bCs/>
-        </w:rPr>
-        <w:t xml:space="preserve">Say: </w:t>
-      </w:r>
-      <w:r>
-        <w:t xml:space="preserve">We will run the real compiler now. First a missing semicolon, with the explanation and the recommended fix; then an ambiguous expression where IntelliFix asks us what we meant; then the AST explorer and a before-and-after comparison; and finally anything you would like to type. If the compiler badge ever says Compiler missing, that means the native compiler is not built on this laptop — we never show screenshots in place of live output.</w:t>
-      </w:r>
-    </w:p>
-    <w:p>
-      <w:pPr>
-        <w:spacing w:after="80" w:line="276" w:lineRule="auto"/>
-      </w:pPr>
-      <w:r>
-        <w:rPr>
-          <w:b/>
-          <w:bCs/>
-        </w:rPr>
-        <w:t xml:space="preserve">Technical details for the professor: </w:t>
-      </w:r>
-      <w:r>
-        <w:t xml:space="preserve">Checker compares the screen with the expected outcome in the demo script and says so if they differ.</w:t>
-      </w:r>
-    </w:p>
-    <w:p>
-      <w:pPr>
-        <w:spacing w:after="80" w:line="276" w:lineRule="auto"/>
-      </w:pPr>
-      <w:r>
-        <w:rPr>
-          <w:b/>
-          <w:bCs/>
-        </w:rPr>
-        <w:t xml:space="preserve">Live-demo action: </w:t>
-      </w:r>
-      <w:r>
-        <w:t xml:space="preserve">Follow the demo steps on the slide; invite the examiners to type their own code.</w:t>
-      </w:r>
-    </w:p>
-    <w:p>
-      <w:pPr>
-        <w:spacing w:after="80" w:line="276" w:lineRule="auto"/>
-      </w:pPr>
-      <w:r>
-        <w:rPr>
-          <w:b/>
-          <w:bCs/>
-        </w:rPr>
-        <w:t xml:space="preserve">Transition: </w:t>
-      </w:r>
-      <w:r>
-        <w:t xml:space="preserve">To finish, our contribution and next steps.</w:t>
-      </w:r>
-    </w:p>
-    <w:p>
-      <w:pPr>
-        <w:pStyle w:val="Heading2"/>
-      </w:pPr>
-      <w:r>
-        <w:t xml:space="preserve">Slide 15 — Contribution and future work</w:t>
-      </w:r>
-    </w:p>
-    <w:p>
-      <w:pPr>
-        <w:spacing w:after="80" w:line="276" w:lineRule="auto"/>
-      </w:pPr>
-      <w:r>
-        <w:rPr>
-          <w:b/>
-          <w:bCs/>
-        </w:rPr>
-        <w:t xml:space="preserve">Speaker: </w:t>
-      </w:r>
-      <w:r>
-        <w:t xml:space="preserve">Raguraman Govindasamy  ·  about 1 min</w:t>
-      </w:r>
-    </w:p>
-    <w:p>
-      <w:pPr>
-        <w:spacing w:after="80" w:line="276" w:lineRule="auto"/>
-      </w:pPr>
-      <w:r>
-        <w:rPr>
-          <w:b/>
-          <w:bCs/>
-        </w:rPr>
-        <w:t xml:space="preserve">Say: </w:t>
-      </w:r>
-      <w:r>
-        <w:t xml:space="preserve">Our contribution is not a new algorithm. It is an integrated, inspectable pipeline that adds layout evidence, interpretable ranking, structural grouping, abstention and interactive clarification to known LR repair techniques, with explanations and an AST explorer for beginners, and an honest evaluation. Next we want to test it with real student errors, run a user study of the question feature, learn the weights from real data, and verify the Windows build natively. Thank you — we are happy to take questions.</w:t>
-      </w:r>
-    </w:p>
-    <w:p>
-      <w:pPr>
-        <w:spacing w:after="80" w:line="276" w:lineRule="auto"/>
-      </w:pPr>
-      <w:r>
-        <w:rPr>
-          <w:b/>
-          <w:bCs/>
-        </w:rPr>
-        <w:t xml:space="preserve">Technical details for the professor: </w:t>
-      </w:r>
-      <w:r>
-        <w:t xml:space="preserve">Supported: ranking +16.3, layout +8.9, abstention −22.4 points wrong-confident. Not supported: stability. Not measured: usability.</w:t>
-      </w:r>
-    </w:p>
-    <w:p>
-      <w:pPr>
-        <w:spacing w:after="80" w:line="276" w:lineRule="auto"/>
-      </w:pPr>
-      <w:r>
-        <w:rPr>
-          <w:b/>
-          <w:bCs/>
-        </w:rPr>
-        <w:t xml:space="preserve">Live-demo action: </w:t>
-      </w:r>
-      <w:r>
-        <w:t xml:space="preserve">Workspace cleared, ready for questions.</w:t>
-      </w:r>
-    </w:p>
-    <w:p>
-      <w:pPr>
-        <w:spacing w:after="80" w:line="276" w:lineRule="auto"/>
-      </w:pPr>
-      <w:r>
-        <w:rPr>
-          <w:b/>
-          <w:bCs/>
-        </w:rPr>
-        <w:t xml:space="preserve">Transition: </w:t>
-      </w:r>
-      <w:r>
         <w:t xml:space="preserve">Questions.</w:t>
       </w:r>
     </w:p>
     <w:p>
       <w:pPr>
-        <w:spacing w:after="40" w:before="60"/>
-      </w:pPr>
-      <w:r>
-        <w:rPr>
-          <w:b/>
-          <w:bCs/>
-        </w:rPr>
-        <w:t xml:space="preserve">Likely questions</w:t>
-      </w:r>
-    </w:p>
-    <w:p>
-      <w:pPr>
-        <w:pStyle w:val="ListParagraph"/>
-        <w:numPr>
-          <w:ilvl w:val="0"/>
-          <w:numId w:val="2"/>
-        </w:numPr>
-        <w:spacing w:after="60" w:line="276" w:lineRule="auto"/>
-        <w:jc w:val="left"/>
-      </w:pPr>
-      <w:r>
-        <w:rPr>
-          <w:b/>
-          <w:bCs/>
-        </w:rPr>
-        <w:t xml:space="preserve">What is new here?</w:t>
-      </w:r>
-      <w:r>
-        <w:t xml:space="preserve"> The combination and its measurement, plus the explanation layer; each ingredient is established and cited.</w:t>
-      </w:r>
-    </w:p>
-    <w:p>
-      <w:pPr>
         <w:pStyle w:val="Heading1"/>
       </w:pPr>
       <w:r>
-        <w:t xml:space="preserve">Live demo checklist (slide 14)</w:t>
+        <w:t xml:space="preserve">Live demo checklist</w:t>
       </w:r>
     </w:p>
     <w:p>
@@ -3643,7 +3484,7 @@
         <w:fldChar w:fldCharType="end"/>
       </w:r>
       <w:r>
-        <w:t xml:space="preserve">. Demo steps with the expected screen (observed on the final build, τ = 1.5)</w:t>
+        <w:t xml:space="preserve">. Demo steps with the expected screen (observed on the current build, τ = 1.5)</w:t>
       </w:r>
     </w:p>
     <w:tbl>
@@ -3769,7 +3610,7 @@
                 <w:sz w:val="21"/>
                 <w:szCs w:val="21"/>
               </w:rPr>
-              <w:t xml:space="preserve">Step 2 Diagnosis: Missing delimiter; the parser stopped at line 4 (int); line 3 is probably missing its ;. Compare fixes → Recommended: insert ; at 3:16, score gap 2.00 → Use this fix → Apply &amp; verify → Apply: “Verified”</w:t>
+              <w:t xml:space="preserve">Step 2: Missing delimiter; noticed on line 4, line 3 probably lacks its ;</w:t>
             </w:r>
           </w:p>
         </w:tc>
@@ -3798,7 +3639,7 @@
                 <w:sz w:val="21"/>
                 <w:szCs w:val="21"/>
               </w:rPr>
-              <w:t xml:space="preserve">Load sample “Missing expression after +” → Analyze → step 3 Fixes</w:t>
+              <w:t xml:space="preserve">Fixes → Use this fix → Apply &amp; verify → Apply</w:t>
             </w:r>
           </w:p>
         </w:tc>
@@ -3822,7 +3663,7 @@
                 <w:sz w:val="21"/>
                 <w:szCs w:val="21"/>
               </w:rPr>
-              <w:t xml:space="preserve">“Is the + extra, or is something missing after it?”: delete +, replace + with ;, fill in (suggests price), or write the line yourself</w:t>
+              <w:t xml:space="preserve">“Verified: every check IntelliFix performs passes”, corrections and unchecked items listed; Undo restores</w:t>
             </w:r>
           </w:p>
         </w:tc>
@@ -3851,7 +3692,7 @@
                 <w:sz w:val="21"/>
                 <w:szCs w:val="21"/>
               </w:rPr>
-              <w:t xml:space="preserve">Fill in price → Check with the parser → Use this answer → (step 4) → Apply &amp; verify → Apply</w:t>
+              <w:t xml:space="preserve">Paste the several-errors example (price = 5 / price + ; / total++ / return total) → Analyze</w:t>
             </w:r>
           </w:p>
         </w:tc>
@@ -3875,7 +3716,7 @@
                 <w:sz w:val="21"/>
                 <w:szCs w:val="21"/>
               </w:rPr>
-              <w:t xml:space="preserve">“Valid MiniC”; step 4 shows the Error node replaced by DeclStmt; step 5 “Verified”, 1 report disappeared; Undo repair restores the original</w:t>
+              <w:t xml:space="preserve">Several syntax errors; 3 reports with roles; “more may appear once earlier ones are fixed”</w:t>
             </w:r>
           </w:p>
         </w:tc>
@@ -3904,7 +3745,7 @@
                 <w:sz w:val="21"/>
                 <w:szCs w:val="21"/>
               </w:rPr>
-              <w:t xml:space="preserve">AST Explorer → click a node, or click in the code</w:t>
+              <w:t xml:space="preserve">Fixes → Use this fix (; at 2:16) → Apply → Fix the next error</w:t>
             </w:r>
           </w:p>
         </w:tc>
@@ -3928,7 +3769,7 @@
                 <w:sz w:val="21"/>
                 <w:szCs w:val="21"/>
               </w:rPr>
-              <w:t xml:space="preserve">meaning, role in the parent, tokens it absorbs, grammar rule, expression diagram; search marks matching nodes</w:t>
+              <w:t xml:space="preserve">1 no longer reported, 1 newly visible; next error on line 3</w:t>
             </w:r>
           </w:p>
         </w:tc>
@@ -3957,7 +3798,7 @@
                 <w:sz w:val="21"/>
                 <w:szCs w:val="21"/>
               </w:rPr>
-              <w:t xml:space="preserve">Sample Ambiguous operator → Analyze → AST Explorer → Before &amp; after</w:t>
+              <w:t xml:space="preserve">Answer “Is the + extra…?” with price → Check with the parser → Use this answer → Apply</w:t>
             </w:r>
           </w:p>
         </w:tc>
@@ -3981,7 +3822,7 @@
                 <w:sz w:val="21"/>
                 <w:szCs w:val="21"/>
               </w:rPr>
-              <w:t xml:space="preserve">Option 1 (+) vs option 2 (−): 1 structural change, the Binary operator</w:t>
+              <w:t xml:space="preserve">“This error is fixed; later errors remain”; next error: ++</w:t>
             </w:r>
           </w:p>
         </w:tc>
@@ -4010,7 +3851,7 @@
                 <w:sz w:val="21"/>
                 <w:szCs w:val="21"/>
               </w:rPr>
-              <w:t xml:space="preserve">Code with an error → Show a hint ×3 → I'll try it → fix → Check my fix</w:t>
+              <w:t xml:space="preserve">Use the rewrite total = total + 1; → Apply; last ; → Apply</w:t>
             </w:r>
           </w:p>
         </w:tc>
@@ -4034,7 +3875,7 @@
                 <w:sz w:val="21"/>
                 <w:szCs w:val="21"/>
               </w:rPr>
-              <w:t xml:space="preserve">“Your fix works: the program now parses.”</w:t>
+              <w:t xml:space="preserve">Completion summary with 4 corrections</w:t>
             </w:r>
           </w:p>
         </w:tc>
@@ -4063,7 +3904,7 @@
                 <w:sz w:val="21"/>
                 <w:szCs w:val="21"/>
               </w:rPr>
-              <w:t xml:space="preserve">Research &amp; Method</w:t>
+              <w:t xml:space="preserve">AST Explorer → click Binary + → click a ; in the code</w:t>
             </w:r>
           </w:p>
         </w:tc>
@@ -4087,7 +3928,60 @@
                 <w:sz w:val="21"/>
                 <w:szCs w:val="21"/>
               </w:rPr>
-              <w:t xml:space="preserve">71.5% vs 55.2%; 28.5% → 6.1% wrong-but-confident at 50.7% coverage; limitations</w:t>
+              <w:t xml:space="preserve">role, grammar rule, expression diagram; the ; selects its statement</w:t>
+            </w:r>
+          </w:p>
+        </w:tc>
+      </w:tr>
+      <w:tr>
+        <w:trPr>
+          <w:cantSplit/>
+        </w:trPr>
+        <w:tc>
+          <w:tcPr>
+            <w:tcW w:type="dxa" w:w="3536"/>
+            <w:tcMar>
+              <w:top w:type="dxa" w:w="40"/>
+              <w:left w:type="dxa" w:w="80"/>
+              <w:bottom w:type="dxa" w:w="40"/>
+              <w:right w:type="dxa" w:w="80"/>
+            </w:tcMar>
+          </w:tcPr>
+          <w:p>
+            <w:pPr>
+              <w:spacing w:after="0" w:line="240"/>
+              <w:jc w:val="left"/>
+            </w:pPr>
+            <w:r>
+              <w:rPr>
+                <w:sz w:val="21"/>
+                <w:szCs w:val="21"/>
+              </w:rPr>
+              <w:t xml:space="preserve">Research &amp; Method (brief)</w:t>
+            </w:r>
+          </w:p>
+        </w:tc>
+        <w:tc>
+          <w:tcPr>
+            <w:tcW w:type="dxa" w:w="5770"/>
+            <w:tcMar>
+              <w:top w:type="dxa" w:w="40"/>
+              <w:left w:type="dxa" w:w="80"/>
+              <w:bottom w:type="dxa" w:w="40"/>
+              <w:right w:type="dxa" w:w="80"/>
+            </w:tcMar>
+          </w:tcPr>
+          <w:p>
+            <w:pPr>
+              <w:spacing w:after="0" w:line="240"/>
+              <w:jc w:val="left"/>
+            </w:pPr>
+            <w:r>
+              <w:rPr>
+                <w:sz w:val="21"/>
+                <w:szCs w:val="21"/>
+              </w:rPr>
+              <w:t xml:space="preserve">two takeaways; synthetic benchmark, no user study</w:t>
             </w:r>
           </w:p>
         </w:tc>

</xml_diff>